<commit_message>
complete Mca 1st sem
</commit_message>
<xml_diff>
--- a/First Semester/Technical Writing/Technical Writing (Bishal Rijal).docx
+++ b/First Semester/Technical Writing/Technical Writing (Bishal Rijal).docx
@@ -225,13 +225,6 @@
       <w:r>
         <w:rPr>
           <w:rFonts w:ascii="Times New Roman" w:hAnsi="Times New Roman" w:cs="Times New Roman"/>
-          <w:sz w:val="28"/>
-        </w:rPr>
-        <w:t xml:space="preserve"> </w:t>
-      </w:r>
-      <w:r>
-        <w:rPr>
-          <w:rFonts w:ascii="Times New Roman" w:hAnsi="Times New Roman" w:cs="Times New Roman"/>
           <w:b/>
           <w:sz w:val="28"/>
         </w:rPr>
@@ -411,7 +404,21 @@
         <w:rPr>
           <w:sz w:val="28"/>
         </w:rPr>
-        <w:t xml:space="preserve"> Patandhoka, Lalitpur</w:t>
+        <w:t xml:space="preserve"> </w:t>
+      </w:r>
+      <w:proofErr w:type="spellStart"/>
+      <w:r>
+        <w:rPr>
+          <w:sz w:val="28"/>
+        </w:rPr>
+        <w:t>Patandhoka</w:t>
+      </w:r>
+      <w:proofErr w:type="spellEnd"/>
+      <w:r>
+        <w:rPr>
+          <w:sz w:val="28"/>
+        </w:rPr>
+        <w:t>, Lalitpur</w:t>
       </w:r>
     </w:p>
     <w:p>
@@ -430,68 +437,170 @@
     </w:p>
     <w:p>
       <w:pPr>
+        <w:tabs>
+          <w:tab w:val="left" w:pos="630"/>
+        </w:tabs>
+        <w:spacing w:after="0"/>
+        <w:jc w:val="right"/>
+        <w:rPr>
+          <w:rFonts w:ascii="Times New Roman" w:hAnsi="Times New Roman" w:cs="Times New Roman"/>
+          <w:color w:val="000000"/>
+          <w:sz w:val="28"/>
+          <w:szCs w:val="28"/>
+        </w:rPr>
+      </w:pPr>
+      <w:r>
+        <w:rPr>
+          <w:rFonts w:ascii="Times New Roman" w:hAnsi="Times New Roman" w:cs="Times New Roman"/>
+          <w:color w:val="000000"/>
+          <w:sz w:val="28"/>
+          <w:szCs w:val="28"/>
+        </w:rPr>
+        <w:t>Roshan Tandukar</w:t>
+      </w:r>
+    </w:p>
+    <w:p>
+      <w:pPr>
+        <w:tabs>
+          <w:tab w:val="left" w:pos="630"/>
+        </w:tabs>
+        <w:spacing w:after="0"/>
+        <w:rPr>
+          <w:rFonts w:ascii="Times New Roman" w:hAnsi="Times New Roman" w:cs="Times New Roman"/>
+          <w:color w:val="000000"/>
+          <w:sz w:val="28"/>
+          <w:szCs w:val="28"/>
+        </w:rPr>
+      </w:pPr>
+    </w:p>
+    <w:p>
+      <w:pPr>
+        <w:tabs>
+          <w:tab w:val="left" w:pos="630"/>
+        </w:tabs>
+        <w:spacing w:after="0"/>
+        <w:jc w:val="right"/>
+        <w:rPr>
+          <w:rFonts w:ascii="Times New Roman" w:hAnsi="Times New Roman" w:cs="Times New Roman"/>
+          <w:color w:val="000000"/>
+          <w:sz w:val="28"/>
+          <w:szCs w:val="28"/>
+        </w:rPr>
+      </w:pPr>
+      <w:r>
+        <w:rPr>
+          <w:rFonts w:ascii="Times New Roman" w:hAnsi="Times New Roman" w:cs="Times New Roman"/>
+          <w:color w:val="000000"/>
+          <w:sz w:val="28"/>
+          <w:szCs w:val="28"/>
+        </w:rPr>
+        <w:t xml:space="preserve">               </w:t>
+      </w:r>
+      <w:r>
+        <w:rPr>
+          <w:rFonts w:ascii="Times New Roman" w:hAnsi="Times New Roman" w:cs="Times New Roman"/>
+          <w:color w:val="000000"/>
+          <w:sz w:val="28"/>
+          <w:szCs w:val="28"/>
+        </w:rPr>
+        <w:tab/>
+      </w:r>
+      <w:r>
+        <w:rPr>
+          <w:rFonts w:ascii="Times New Roman" w:hAnsi="Times New Roman" w:cs="Times New Roman"/>
+          <w:color w:val="000000"/>
+          <w:sz w:val="28"/>
+          <w:szCs w:val="28"/>
+        </w:rPr>
+        <w:tab/>
+        <w:t xml:space="preserve">             </w:t>
+      </w:r>
+      <w:r>
+        <w:rPr>
+          <w:rFonts w:ascii="Times New Roman" w:hAnsi="Times New Roman" w:cs="Times New Roman"/>
+          <w:color w:val="000000"/>
+          <w:sz w:val="28"/>
+          <w:szCs w:val="28"/>
+        </w:rPr>
+        <w:tab/>
+      </w:r>
+      <w:r>
+        <w:rPr>
+          <w:rFonts w:ascii="Times New Roman" w:hAnsi="Times New Roman" w:cs="Times New Roman"/>
+          <w:color w:val="000000"/>
+          <w:sz w:val="28"/>
+          <w:szCs w:val="28"/>
+        </w:rPr>
+        <w:tab/>
+        <w:t xml:space="preserve">          </w:t>
+      </w:r>
+      <w:r>
+        <w:rPr>
+          <w:rFonts w:ascii="Times New Roman" w:hAnsi="Times New Roman" w:cs="Times New Roman"/>
+          <w:color w:val="000000"/>
+          <w:sz w:val="28"/>
+          <w:szCs w:val="28"/>
+        </w:rPr>
+        <w:tab/>
+      </w:r>
+      <w:r>
+        <w:rPr>
+          <w:rFonts w:ascii="Times New Roman" w:hAnsi="Times New Roman" w:cs="Times New Roman"/>
+          <w:color w:val="000000"/>
+          <w:sz w:val="28"/>
+          <w:szCs w:val="28"/>
+        </w:rPr>
+        <w:tab/>
+      </w:r>
+      <w:r>
+        <w:rPr>
+          <w:rFonts w:ascii="Times New Roman" w:hAnsi="Times New Roman" w:cs="Times New Roman"/>
+          <w:color w:val="000000"/>
+          <w:sz w:val="28"/>
+          <w:szCs w:val="28"/>
+        </w:rPr>
+        <w:tab/>
+      </w:r>
+      <w:r>
+        <w:rPr>
+          <w:rFonts w:ascii="Times New Roman" w:hAnsi="Times New Roman" w:cs="Times New Roman"/>
+          <w:color w:val="000000"/>
+          <w:sz w:val="28"/>
+          <w:szCs w:val="28"/>
+        </w:rPr>
+        <w:tab/>
+      </w:r>
+      <w:r>
+        <w:rPr>
+          <w:rFonts w:ascii="Times New Roman" w:hAnsi="Times New Roman" w:cs="Times New Roman"/>
+          <w:color w:val="000000"/>
+          <w:sz w:val="28"/>
+          <w:szCs w:val="28"/>
+        </w:rPr>
+        <w:tab/>
+        <w:t>………………...</w:t>
+      </w:r>
+    </w:p>
+    <w:p>
+      <w:pPr>
         <w:pStyle w:val="NormalWeb"/>
         <w:tabs>
           <w:tab w:val="center" w:pos="4334"/>
           <w:tab w:val="left" w:pos="7970"/>
         </w:tabs>
-        <w:spacing w:before="0" w:beforeAutospacing="0" w:after="120" w:afterAutospacing="0" w:line="360" w:lineRule="auto"/>
-        <w:jc w:val="center"/>
-        <w:rPr>
-          <w:b/>
-          <w:sz w:val="28"/>
-        </w:rPr>
-      </w:pPr>
-      <w:r>
-        <w:rPr>
-          <w:sz w:val="28"/>
-        </w:rPr>
-        <w:t xml:space="preserve"> </w:t>
-      </w:r>
-      <w:r>
-        <w:rPr>
-          <w:b/>
-          <w:sz w:val="28"/>
-        </w:rPr>
-        <w:t xml:space="preserve">Department of MCA </w:t>
-      </w:r>
-    </w:p>
-    <w:p>
-      <w:pPr>
-        <w:pStyle w:val="NormalWeb"/>
-        <w:tabs>
-          <w:tab w:val="center" w:pos="4334"/>
-          <w:tab w:val="left" w:pos="7970"/>
-        </w:tabs>
         <w:spacing w:before="0" w:beforeAutospacing="0" w:after="0" w:afterAutospacing="0" w:line="360" w:lineRule="auto"/>
         <w:jc w:val="center"/>
         <w:rPr>
-          <w:sz w:val="28"/>
-        </w:rPr>
-      </w:pPr>
-      <w:r>
-        <w:rPr>
-          <w:sz w:val="28"/>
-        </w:rPr>
-        <w:t xml:space="preserve">Affiliated to Tribhuvan University </w:t>
-      </w:r>
-    </w:p>
-    <w:p>
-      <w:pPr>
-        <w:pStyle w:val="NormalWeb"/>
-        <w:tabs>
-          <w:tab w:val="center" w:pos="4334"/>
-          <w:tab w:val="left" w:pos="7970"/>
-        </w:tabs>
-        <w:spacing w:before="0" w:beforeAutospacing="0" w:after="0" w:afterAutospacing="0" w:line="360" w:lineRule="auto"/>
-        <w:rPr>
-          <w:sz w:val="40"/>
-        </w:rPr>
-      </w:pPr>
-      <w:r>
-        <w:rPr>
-          <w:sz w:val="40"/>
-        </w:rPr>
+          <w:sz w:val="36"/>
+          <w:szCs w:val="32"/>
+        </w:rPr>
+      </w:pPr>
+      <w:r>
+        <w:rPr>
+          <w:sz w:val="48"/>
+          <w:szCs w:val="32"/>
+        </w:rPr>
+        <w:lastRenderedPageBreak/>
         <w:br w:type="page"/>
       </w:r>
     </w:p>
@@ -611,31 +720,6 @@
         </w:rPr>
         <w:t>is not only to explain web development but also to demonstrate the principles of technical communication by presenting complex technical information in a structured, clear, concise, and audience-oriented form.</w:t>
       </w:r>
-    </w:p>
-    <w:p>
-      <w:pPr>
-        <w:pStyle w:val="NormalWeb"/>
-        <w:shd w:val="clear" w:color="auto" w:fill="FFFFFF"/>
-        <w:spacing w:before="0" w:beforeAutospacing="0" w:after="240" w:afterAutospacing="0" w:line="360" w:lineRule="auto"/>
-        <w:jc w:val="both"/>
-      </w:pPr>
-      <w:r>
-        <w:rPr>
-          <w:color w:val="0F1115"/>
-        </w:rPr>
-        <w:t>Keywords: Web Development, Frontend, Backend, Database, Full-Stack Development, Career Roadmap, Technical Writing, Webinar, Software Development</w:t>
-      </w:r>
-    </w:p>
-    <w:p>
-      <w:pPr>
-        <w:spacing w:after="120" w:line="360" w:lineRule="auto"/>
-        <w:jc w:val="both"/>
-        <w:rPr>
-          <w:rFonts w:ascii="Times New Roman" w:hAnsi="Times New Roman" w:cs="Times New Roman"/>
-          <w:sz w:val="24"/>
-          <w:szCs w:val="24"/>
-        </w:rPr>
-      </w:pPr>
     </w:p>
     <w:p>
       <w:pPr>
@@ -13053,6 +13137,7 @@
                 <w:sz w:val="24"/>
                 <w:szCs w:val="24"/>
               </w:rPr>
+              <w:lastRenderedPageBreak/>
               <w:t>SOAP</w:t>
             </w:r>
           </w:p>
@@ -18080,6 +18165,7 @@
                 <w:szCs w:val="24"/>
                 <w:lang w:eastAsia="en-GB"/>
               </w:rPr>
+              <w:lastRenderedPageBreak/>
               <w:t>Time overrun</w:t>
             </w:r>
           </w:p>

</xml_diff>